<commit_message>
Refine field forms for handwriting, confirm execution partners, add preview PDF
Co-Authored-By: Claude Opus 5.5 <noreply@anthropic.com>
Claude-Session: https://claude.ai/code/session_011325MfbBHhaGptF2xnLjfW
</commit_message>
<xml_diff>
--- a/deliverables/jersey-embryo-bid-2026/07_하도급·업무위탁_계획서.docx
+++ b/deliverables/jersey-embryo-bid-2026/07_하도급·업무위탁_계획서.docx
@@ -580,9 +580,27 @@
                 <w:sz w:val="17"/>
                 <w:szCs w:val="17"/>
               </w:rPr>
-              <w:t xml:space="preserve">[고려동물병원]</w:t>
-            </w:r>
-          </w:p>
+              <w:t xml:space="preserve">고려동물병원</w:t>
+            </w:r>
+          </w:p>
+        </w:tc>
+        <w:tc>
+          <w:tcPr>
+            <w:tcW w:type="dxa" w:w="2300"/>
+            <w:tcBorders>
+              <w:top w:val="single" w:color="808080" w:sz="4"/>
+              <w:left w:val="single" w:color="808080" w:sz="4"/>
+              <w:bottom w:val="single" w:color="808080" w:sz="4"/>
+              <w:right w:val="single" w:color="808080" w:sz="4"/>
+            </w:tcBorders>
+            <w:tcMar>
+              <w:top w:type="dxa" w:w="60"/>
+              <w:left w:type="dxa" w:w="100"/>
+              <w:bottom w:type="dxa" w:w="60"/>
+              <w:right w:type="dxa" w:w="100"/>
+            </w:tcMar>
+            <w:vAlign w:val="center"/>
+          </w:tcPr>
           <w:p>
             <w:pPr>
               <w:spacing w:after="0" w:before="0" w:line="260"/>
@@ -594,13 +612,13 @@
                 <w:sz w:val="17"/>
                 <w:szCs w:val="17"/>
               </w:rPr>
-              <w:t xml:space="preserve">(확인 필요)</w:t>
-            </w:r>
-          </w:p>
-        </w:tc>
-        <w:tc>
-          <w:tcPr>
-            <w:tcW w:type="dxa" w:w="2300"/>
+              <w:t xml:space="preserve">사업대상 4개 조합 13농가 수란우 선발·동기화, 수정란 이식 160건, 임신감정</w:t>
+            </w:r>
+          </w:p>
+        </w:tc>
+        <w:tc>
+          <w:tcPr>
+            <w:tcW w:type="dxa" w:w="1900"/>
             <w:tcBorders>
               <w:top w:val="single" w:color="808080" w:sz="4"/>
               <w:left w:val="single" w:color="808080" w:sz="4"/>
@@ -626,27 +644,9 @@
                 <w:sz w:val="17"/>
                 <w:szCs w:val="17"/>
               </w:rPr>
-              <w:t xml:space="preserve">사업대상 4개 조합 13농가 수란우 선발·동기화, 수정란 이식 160건, 임신감정</w:t>
-            </w:r>
-          </w:p>
-        </w:tc>
-        <w:tc>
-          <w:tcPr>
-            <w:tcW w:type="dxa" w:w="1900"/>
-            <w:tcBorders>
-              <w:top w:val="single" w:color="808080" w:sz="4"/>
-              <w:left w:val="single" w:color="808080" w:sz="4"/>
-              <w:bottom w:val="single" w:color="808080" w:sz="4"/>
-              <w:right w:val="single" w:color="808080" w:sz="4"/>
-            </w:tcBorders>
-            <w:tcMar>
-              <w:top w:type="dxa" w:w="60"/>
-              <w:left w:type="dxa" w:w="100"/>
-              <w:bottom w:type="dxa" w:w="60"/>
-              <w:right w:type="dxa" w:w="100"/>
-            </w:tcMar>
-            <w:vAlign w:val="center"/>
-          </w:tcPr>
+              <w:t xml:space="preserve">수의사 ○명 (이식담당자 2명 이내)</w:t>
+            </w:r>
+          </w:p>
           <w:p>
             <w:pPr>
               <w:spacing w:after="0" w:before="0" w:line="260"/>
@@ -658,9 +658,27 @@
                 <w:sz w:val="17"/>
                 <w:szCs w:val="17"/>
               </w:rPr>
-              <w:t xml:space="preserve">수의사 ○명 (이식담당자 2명 이내)</w:t>
-            </w:r>
-          </w:p>
+              <w:t xml:space="preserve">면허번호:</w:t>
+            </w:r>
+          </w:p>
+        </w:tc>
+        <w:tc>
+          <w:tcPr>
+            <w:tcW w:type="dxa" w:w="2038"/>
+            <w:tcBorders>
+              <w:top w:val="single" w:color="808080" w:sz="4"/>
+              <w:left w:val="single" w:color="808080" w:sz="4"/>
+              <w:bottom w:val="single" w:color="808080" w:sz="4"/>
+              <w:right w:val="single" w:color="808080" w:sz="4"/>
+            </w:tcBorders>
+            <w:tcMar>
+              <w:top w:type="dxa" w:w="60"/>
+              <w:left w:type="dxa" w:w="100"/>
+              <w:bottom w:type="dxa" w:w="60"/>
+              <w:right w:type="dxa" w:w="100"/>
+            </w:tcMar>
+            <w:vAlign w:val="center"/>
+          </w:tcPr>
           <w:p>
             <w:pPr>
               <w:spacing w:after="0" w:before="0" w:line="260"/>
@@ -672,27 +690,9 @@
                 <w:sz w:val="17"/>
                 <w:szCs w:val="17"/>
               </w:rPr>
-              <w:t xml:space="preserve">면허번호:</w:t>
-            </w:r>
-          </w:p>
-        </w:tc>
-        <w:tc>
-          <w:tcPr>
-            <w:tcW w:type="dxa" w:w="2038"/>
-            <w:tcBorders>
-              <w:top w:val="single" w:color="808080" w:sz="4"/>
-              <w:left w:val="single" w:color="808080" w:sz="4"/>
-              <w:bottom w:val="single" w:color="808080" w:sz="4"/>
-              <w:right w:val="single" w:color="808080" w:sz="4"/>
-            </w:tcBorders>
-            <w:tcMar>
-              <w:top w:type="dxa" w:w="60"/>
-              <w:left w:type="dxa" w:w="100"/>
-              <w:bottom w:type="dxa" w:w="60"/>
-              <w:right w:type="dxa" w:w="100"/>
-            </w:tcMar>
-            <w:vAlign w:val="center"/>
-          </w:tcPr>
+              <w:t xml:space="preserve">'24~'26 이식 수행 농가 ○호</w:t>
+            </w:r>
+          </w:p>
           <w:p>
             <w:pPr>
               <w:spacing w:after="0" w:before="0" w:line="260"/>
@@ -704,9 +704,29 @@
                 <w:sz w:val="17"/>
                 <w:szCs w:val="17"/>
               </w:rPr>
-              <w:t xml:space="preserve">'24~'26 이식 수행 농가 ○호</w:t>
-            </w:r>
-          </w:p>
+              <w:t xml:space="preserve">진료차량·초음파 장비</w:t>
+            </w:r>
+          </w:p>
+        </w:tc>
+      </w:tr>
+      <w:tr>
+        <w:tc>
+          <w:tcPr>
+            <w:tcW w:type="dxa" w:w="1500"/>
+            <w:tcBorders>
+              <w:top w:val="single" w:color="808080" w:sz="4"/>
+              <w:left w:val="single" w:color="808080" w:sz="4"/>
+              <w:bottom w:val="single" w:color="808080" w:sz="4"/>
+              <w:right w:val="single" w:color="808080" w:sz="4"/>
+            </w:tcBorders>
+            <w:tcMar>
+              <w:top w:type="dxa" w:w="60"/>
+              <w:left w:type="dxa" w:w="100"/>
+              <w:bottom w:type="dxa" w:w="60"/>
+              <w:right w:type="dxa" w:w="100"/>
+            </w:tcMar>
+            <w:vAlign w:val="center"/>
+          </w:tcPr>
           <w:p>
             <w:pPr>
               <w:spacing w:after="0" w:before="0" w:line="260"/>
@@ -718,15 +738,13 @@
                 <w:sz w:val="17"/>
                 <w:szCs w:val="17"/>
               </w:rPr>
-              <w:t xml:space="preserve">진료차량·초음파 장비</w:t>
-            </w:r>
-          </w:p>
-        </w:tc>
-      </w:tr>
-      <w:tr>
-        <w:tc>
-          <w:tcPr>
-            <w:tcW w:type="dxa" w:w="1500"/>
+              <w:t xml:space="preserve">공란우 사육·관리</w:t>
+            </w:r>
+          </w:p>
+        </w:tc>
+        <w:tc>
+          <w:tcPr>
+            <w:tcW w:type="dxa" w:w="1900"/>
             <w:tcBorders>
               <w:top w:val="single" w:color="808080" w:sz="4"/>
               <w:left w:val="single" w:color="808080" w:sz="4"/>
@@ -752,39 +770,7 @@
                 <w:sz w:val="17"/>
                 <w:szCs w:val="17"/>
               </w:rPr>
-              <w:t xml:space="preserve">공란우 사육·관리</w:t>
-            </w:r>
-          </w:p>
-        </w:tc>
-        <w:tc>
-          <w:tcPr>
-            <w:tcW w:type="dxa" w:w="1900"/>
-            <w:tcBorders>
-              <w:top w:val="single" w:color="808080" w:sz="4"/>
-              <w:left w:val="single" w:color="808080" w:sz="4"/>
-              <w:bottom w:val="single" w:color="808080" w:sz="4"/>
-              <w:right w:val="single" w:color="808080" w:sz="4"/>
-            </w:tcBorders>
-            <w:tcMar>
-              <w:top w:type="dxa" w:w="60"/>
-              <w:left w:type="dxa" w:w="100"/>
-              <w:bottom w:type="dxa" w:w="60"/>
-              <w:right w:type="dxa" w:w="100"/>
-            </w:tcMar>
-            <w:vAlign w:val="center"/>
-          </w:tcPr>
-          <w:p>
-            <w:pPr>
-              <w:spacing w:after="0" w:before="0" w:line="260"/>
-              <w:jc w:val="left"/>
-            </w:pPr>
-            <w:r>
-              <w:rPr>
-                <w:rFonts w:ascii="맑은 고딕" w:cs="맑은 고딕" w:eastAsia="맑은 고딕" w:hAnsi="맑은 고딕"/>
-                <w:sz w:val="17"/>
-                <w:szCs w:val="17"/>
-              </w:rPr>
-              <w:t xml:space="preserve">[송영신목장]</w:t>
+              <w:t xml:space="preserve">송영신목장</w:t>
             </w:r>
           </w:p>
         </w:tc>

</xml_diff>